<commit_message>
added technical seminar topic
</commit_message>
<xml_diff>
--- a/iot.docx
+++ b/iot.docx
@@ -265,9 +265,9 @@
                           <a:avLst/>
                           <a:gdLst>
                             <a:gd name="textAreaLeft" fmla="*/ 0 w 3628800"/>
-                            <a:gd name="textAreaRight" fmla="*/ 3629880 w 3628800"/>
+                            <a:gd name="textAreaRight" fmla="*/ 3630240 w 3628800"/>
                             <a:gd name="textAreaTop" fmla="*/ 0 h 720"/>
-                            <a:gd name="textAreaBottom" fmla="*/ 2160 h 720"/>
+                            <a:gd name="textAreaBottom" fmla="*/ 3240 h 720"/>
                           </a:gdLst>
                           <a:ahLst/>
                           <a:rect l="textAreaLeft" t="textAreaTop" r="textAreaRight" b="textAreaBottom"/>
@@ -345,9 +345,31 @@
       <w:r>
         <w:rPr>
           <w:b/>
-          <w:sz w:val="28"/>
-        </w:rPr>
-        <w:t xml:space="preserve">14/05/2025 </w:t>
+          <w:spacing w:val="-18"/>
+          <w:sz w:val="28"/>
+        </w:rPr>
+        <w:t>06</w:t>
+      </w:r>
+      <w:r>
+        <w:rPr>
+          <w:b/>
+          <w:sz w:val="28"/>
+        </w:rPr>
+        <w:t>/0</w:t>
+      </w:r>
+      <w:r>
+        <w:rPr>
+          <w:b/>
+          <w:sz w:val="28"/>
+        </w:rPr>
+        <w:t>6</w:t>
+      </w:r>
+      <w:r>
+        <w:rPr>
+          <w:b/>
+          <w:sz w:val="28"/>
+        </w:rPr>
+        <w:t xml:space="preserve">/2025 </w:t>
       </w:r>
     </w:p>
     <w:p>
@@ -366,7 +388,7 @@
           <w:b/>
           <w:sz w:val="28"/>
         </w:rPr>
-        <w:t>IV SEMESTER – MCA491P Major Project</w:t>
+        <w:t>IV SEMESTER – MCA492L Technical Seminar</w:t>
       </w:r>
     </w:p>
     <w:p>
@@ -396,14 +418,24 @@
           <w:bCs/>
           <w:sz w:val="28"/>
         </w:rPr>
-        <w:t>LoRa-Based Location Tracking and Fall Detection System</w:t>
-      </w:r>
-      <w:r>
-        <w:rPr>
-          <w:b/>
-          <w:sz w:val="28"/>
-        </w:rPr>
-        <w:t xml:space="preserve"> </w:t>
+        <w:t>Screenless Displays: The Future of Visual Interaction</w:t>
+      </w:r>
+    </w:p>
+    <w:p>
+      <w:pPr>
+        <w:pStyle w:val="Normal"/>
+        <w:widowControl w:val="false"/>
+        <w:bidi w:val="0"/>
+        <w:spacing w:lineRule="auto" w:line="240" w:before="0" w:after="0"/>
+        <w:ind w:hanging="0" w:left="0" w:right="0"/>
+        <w:jc w:val="center"/>
+        <w:rPr>
+          <w:b/>
+          <w:sz w:val="28"/>
+        </w:rPr>
+      </w:pPr>
+      <w:r>
+        <w:rPr/>
       </w:r>
     </w:p>
     <w:p>
@@ -431,7 +463,24 @@
     <w:p>
       <w:pPr>
         <w:pStyle w:val="Normal"/>
-        <w:spacing w:lineRule="auto" w:line="240" w:before="57" w:after="57"/>
+        <w:widowControl w:val="false"/>
+        <w:bidi w:val="0"/>
+        <w:spacing w:lineRule="auto" w:line="240" w:before="171" w:after="171"/>
+        <w:ind w:hanging="0" w:left="0" w:right="0"/>
+        <w:jc w:val="center"/>
+        <w:rPr>
+          <w:b/>
+          <w:sz w:val="28"/>
+        </w:rPr>
+      </w:pPr>
+      <w:r>
+        <w:rPr/>
+      </w:r>
+    </w:p>
+    <w:p>
+      <w:pPr>
+        <w:pStyle w:val="Normal"/>
+        <w:spacing w:lineRule="auto" w:line="276" w:before="57" w:after="57"/>
         <w:ind w:hanging="0" w:left="142" w:right="12"/>
         <w:jc w:val="both"/>
         <w:rPr/>
@@ -444,13 +493,13 @@
           <w:sz w:val="24"/>
           <w:szCs w:val="24"/>
         </w:rPr>
-        <w:t>The exploration of India's remote hills, dense forests, and mountainous terrain offers adventure while simultaneously presenting significant safety concerns. Approximately 70% of these isolated regions lack mobile network coverage, Wi-Fi connectivity, or any reliable means of communication during emergencies. Trekkers face substantial risks including disorientation, physical injury from falls, and medical emergencies often without access to emergency response services. To address these critical safety gaps, a LoRa-based location approximation and fall detection system will be developed specifically for off-grid trekking environments. This solution leverages long-range, low-power radio technology capable of maintaining connectivity across distances of 10-15 kilometers, ensuring trekkers remain connected with their expedition group and can transmit emergency signals without dependence on cellular or internet infrastructure. With an estimated 15 million individuals participating annually in trekking and adventure tourism activities throughout India, and the sector experiencing robust growth at a CAGR exceeding 17%, there exists a pressing demand for a reliable, offline safety solution that provides real-time alerts.</w:t>
+        <w:t>Screenless display technology is transforming visual interaction by eliminating reliance on traditional physical screens. This innovative approach enables digital content to seamlessly integrate with the physical environment whether projected into open space, overlaid onto real-world surfaces, or transmitted directly onto the human retina. Employing advanced methods such as holography, augmented reality (AR), and retinal projection, these systems facilitate immersive, hands-free visual experiences. The shift toward a post-screen paradigm promotes more intuitive, integrated, and unobtrusive means of accessing and interacting with digital information across diverse applications</w:t>
       </w:r>
     </w:p>
     <w:p>
       <w:pPr>
         <w:pStyle w:val="BodyText"/>
-        <w:spacing w:lineRule="auto" w:line="240" w:before="240" w:after="114"/>
+        <w:spacing w:lineRule="auto" w:line="276" w:before="240" w:after="114"/>
         <w:ind w:hanging="0" w:left="142" w:right="12"/>
         <w:jc w:val="both"/>
         <w:rPr/>
@@ -464,8 +513,17 @@
           <w:sz w:val="24"/>
           <w:szCs w:val="24"/>
         </w:rPr>
-        <w:t xml:space="preserve">The device designed for trekkers </w:t>
-      </w:r>
+        <w:t>Recent advancements in screenless display technology, including retinal projection systems, deliver high-resolution visuals directly onto the retina, thereby removing the necessity for physical display panels. Concurrently, holographic displays and AR devices are evolving toward more compact, intelligent designs capable of rendering three-dimensional content and real-time data overlays. The fusion of artificial intelligence, eye-tracking, and spatial computing enables these systems to dynamically tailor visual output according to contextual variables and detected user intent or emotion. Emerging platforms such as Mojo Lens and Microsoft HoloLens exemplify early progress toward fully immersive and responsive screenless ecosystems.</w:t>
+      </w:r>
+    </w:p>
+    <w:p>
+      <w:pPr>
+        <w:pStyle w:val="BodyText"/>
+        <w:spacing w:lineRule="auto" w:line="276" w:before="240" w:after="114"/>
+        <w:ind w:hanging="0" w:left="142" w:right="12"/>
+        <w:jc w:val="both"/>
+        <w:rPr/>
+      </w:pPr>
       <w:r>
         <w:rPr>
           <w:rStyle w:val="StrongEmphasis"/>
@@ -475,9 +533,15 @@
           <w:sz w:val="24"/>
           <w:szCs w:val="24"/>
         </w:rPr>
-        <w:t>will</w:t>
-      </w:r>
-      <w:r>
+        <w:t>In the near future, screenless display technology is anticipated to transform key sectors such as healthcare, education, defense, and entertainment. Retina-based displays can facilitate real-time data visualization in surgical environments, while holographic systems may enable interactive three-dimensional educational content. Smart wearable devices, including contact lenses with embedded display capabilities, are projected to provide seamless access to digital information without the need for physical interfaces. As the boundaries between the digital and physical environments continue to blur, screenless display technology is positioned to play a central role in redefining the methods of visual communication and information interaction.</w:t>
+      </w:r>
+    </w:p>
+    <w:p>
+      <w:pPr>
+        <w:pStyle w:val="BodyText"/>
+        <w:spacing w:lineRule="auto" w:line="240" w:before="240" w:after="114"/>
+        <w:ind w:hanging="0" w:left="142" w:right="12"/>
+        <w:jc w:val="both"/>
         <w:rPr>
           <w:rStyle w:val="StrongEmphasis"/>
           <w:rFonts w:ascii="Liberation Serif" w:hAnsi="Liberation Serif"/>
@@ -486,9 +550,17 @@
           <w:sz w:val="24"/>
           <w:szCs w:val="24"/>
         </w:rPr>
-        <w:t xml:space="preserve"> use  ESP32 microcontroller paired with a LoRa module, running lightweight Python scripts to enable simple and reliable communication between devices. Each wearable is  send out small data packets at regular intervals and any detected falls. Fall detection will be managed directly on the device using motion sensors like an accelerometer and gyroscope, allowing it to raise an alert quickly if something goes wrong. Operating fully offline, the system won’t require GPS, Wi-Fi, or mobile networks. Instead, it estimate the trekker’s location using signal strength (RSSI) received by other ESP32+LoRa nodes positioned at known fixed locations. These nodes will collaborate to determine the source of the signal using trilateration. The gathered information can then be transmitted to a mobile device or local interface via Bluetooth </w:t>
-      </w:r>
-      <w:r>
+      </w:pPr>
+      <w:r>
+        <w:rPr/>
+      </w:r>
+    </w:p>
+    <w:p>
+      <w:pPr>
+        <w:pStyle w:val="BodyText"/>
+        <w:spacing w:lineRule="auto" w:line="240" w:before="240" w:after="114"/>
+        <w:ind w:hanging="0" w:left="142" w:right="12"/>
+        <w:jc w:val="both"/>
         <w:rPr>
           <w:rStyle w:val="StrongEmphasis"/>
           <w:rFonts w:ascii="Liberation Serif" w:hAnsi="Liberation Serif"/>
@@ -497,85 +569,9 @@
           <w:sz w:val="24"/>
           <w:szCs w:val="24"/>
         </w:rPr>
-        <w:t xml:space="preserve">or </w:t>
-      </w:r>
-      <w:r>
-        <w:rPr>
-          <w:rStyle w:val="StrongEmphasis"/>
-          <w:rFonts w:ascii="Liberation Serif" w:hAnsi="Liberation Serif"/>
-          <w:b w:val="false"/>
-          <w:bCs w:val="false"/>
-          <w:sz w:val="24"/>
-          <w:szCs w:val="24"/>
-        </w:rPr>
-        <w:t>Wi-Fi and displayed through a user-friendly interface built with React Native and Next.js.</w:t>
-      </w:r>
-    </w:p>
-    <w:p>
-      <w:pPr>
-        <w:pStyle w:val="BodyText"/>
-        <w:spacing w:lineRule="auto" w:line="240" w:before="240" w:after="114"/>
-        <w:ind w:hanging="0" w:left="142" w:right="12"/>
-        <w:jc w:val="both"/>
-        <w:rPr>
-          <w:rFonts w:ascii="Liberation Serif" w:hAnsi="Liberation Serif"/>
-          <w:b w:val="false"/>
-          <w:bCs w:val="false"/>
-          <w:sz w:val="24"/>
-          <w:szCs w:val="24"/>
-        </w:rPr>
-      </w:pPr>
-      <w:r>
-        <w:rPr>
-          <w:rStyle w:val="StrongEmphasis"/>
-          <w:rFonts w:ascii="Liberation Serif" w:hAnsi="Liberation Serif"/>
-          <w:b w:val="false"/>
-          <w:bCs w:val="false"/>
-          <w:sz w:val="24"/>
-          <w:szCs w:val="24"/>
-        </w:rPr>
-        <w:t>The expected outcome</w:t>
-      </w:r>
-      <w:r>
-        <w:rPr>
-          <w:rStyle w:val="StrongEmphasis"/>
-          <w:rFonts w:ascii="Liberation Serif" w:hAnsi="Liberation Serif"/>
-          <w:b w:val="false"/>
-          <w:bCs w:val="false"/>
-          <w:sz w:val="24"/>
-          <w:szCs w:val="24"/>
-        </w:rPr>
-        <w:t>s</w:t>
-      </w:r>
-      <w:r>
-        <w:rPr>
-          <w:rStyle w:val="StrongEmphasis"/>
-          <w:rFonts w:ascii="Liberation Serif" w:hAnsi="Liberation Serif"/>
-          <w:b w:val="false"/>
-          <w:bCs w:val="false"/>
-          <w:sz w:val="24"/>
-          <w:szCs w:val="24"/>
-        </w:rPr>
-        <w:t xml:space="preserve"> of this project is to provide trekkers with a safer, more confident, and well-connected trekking experience. The system will enable real-time alerts in the event of a fall or if a trekker goes missing, ensuring timely response even in remote, disconnected environments. It will also record each trekker’s movement using location approximation techniques, allowing for post-trek analysis and improved planning for future expeditions. Designed to be lightweight, energy-efficient, and fully independent of mobile networks or internet access, the solution is well-suited for extended treks through challenging terrain. Ultimately, the project aims to enhance safety, preparedness, and peace of mind for both trekkers and their families, especially in areas where traditional communication and rescue options are limited.</w:t>
-      </w:r>
-    </w:p>
-    <w:p>
-      <w:pPr>
-        <w:pStyle w:val="Normal"/>
-        <w:spacing w:lineRule="auto" w:line="240" w:before="240" w:after="114"/>
-        <w:ind w:hanging="0" w:left="142" w:right="12"/>
-        <w:jc w:val="both"/>
-        <w:rPr>
-          <w:rStyle w:val="StrongEmphasis"/>
-          <w:b w:val="false"/>
-          <w:bCs w:val="false"/>
-        </w:rPr>
-      </w:pPr>
-      <w:r>
-        <w:rPr>
-          <w:b w:val="false"/>
-          <w:bCs w:val="false"/>
-        </w:rPr>
+      </w:pPr>
+      <w:r>
+        <w:rPr/>
       </w:r>
     </w:p>
     <w:tbl>
@@ -593,9 +589,9 @@
       </w:tblPr>
       <w:tblGrid>
         <w:gridCol w:w="1858"/>
-        <w:gridCol w:w="2602"/>
-        <w:gridCol w:w="2432"/>
-        <w:gridCol w:w="3313"/>
+        <w:gridCol w:w="2601"/>
+        <w:gridCol w:w="2433"/>
+        <w:gridCol w:w="3312"/>
       </w:tblGrid>
       <w:tr>
         <w:trPr/>
@@ -635,7 +631,7 @@
         </w:tc>
         <w:tc>
           <w:tcPr>
-            <w:tcW w:w="2602" w:type="dxa"/>
+            <w:tcW w:w="2601" w:type="dxa"/>
             <w:tcBorders/>
           </w:tcPr>
           <w:p>
@@ -669,7 +665,7 @@
         </w:tc>
         <w:tc>
           <w:tcPr>
-            <w:tcW w:w="2432" w:type="dxa"/>
+            <w:tcW w:w="2433" w:type="dxa"/>
             <w:tcBorders/>
           </w:tcPr>
           <w:p>
@@ -703,7 +699,7 @@
         </w:tc>
         <w:tc>
           <w:tcPr>
-            <w:tcW w:w="3313" w:type="dxa"/>
+            <w:tcW w:w="3312" w:type="dxa"/>
             <w:tcBorders/>
           </w:tcPr>
           <w:p>
@@ -798,7 +794,7 @@
         </w:tc>
         <w:tc>
           <w:tcPr>
-            <w:tcW w:w="2602" w:type="dxa"/>
+            <w:tcW w:w="2601" w:type="dxa"/>
             <w:tcBorders/>
           </w:tcPr>
           <w:p>
@@ -882,7 +878,7 @@
         </w:tc>
         <w:tc>
           <w:tcPr>
-            <w:tcW w:w="2432" w:type="dxa"/>
+            <w:tcW w:w="2433" w:type="dxa"/>
             <w:tcBorders/>
           </w:tcPr>
           <w:p>
@@ -906,7 +902,7 @@
         </w:tc>
         <w:tc>
           <w:tcPr>
-            <w:tcW w:w="3313" w:type="dxa"/>
+            <w:tcW w:w="3312" w:type="dxa"/>
             <w:tcBorders/>
           </w:tcPr>
           <w:p>
@@ -958,16 +954,7 @@
                 <w:sz w:val="24"/>
                 <w:szCs w:val="24"/>
               </w:rPr>
-              <w:t xml:space="preserve">Associate Professor </w:t>
-            </w:r>
-            <w:r>
-              <w:rPr>
-                <w:b w:val="false"/>
-                <w:bCs w:val="false"/>
-                <w:sz w:val="24"/>
-                <w:szCs w:val="24"/>
-              </w:rPr>
-              <w:t>&amp; Director</w:t>
+              <w:t>Associate Professor &amp; Director</w:t>
             </w:r>
           </w:p>
           <w:p>

</xml_diff>